<commit_message>
Publish latest Story Atlas Pages build
</commit_message>
<xml_diff>
--- a/games/peril-to-profit-story-atlas/exports/gm/rule/long-rest.docx
+++ b/games/peril-to-profit-story-atlas/exports/gm/rule/long-rest.docx
@@ -23,7 +23,7 @@
         <w:pStyle w:val="Normal"/>
       </w:pPr>
       <w:r>
-        <w:t xml:space="preserve">A deeper downtime recovery and reset structure used when the story has enough time.</w:t>
+        <w:t xml:space="preserve">Extended downtime recovery; the GM gains 1d4 plus the number of PCs in Fear and may advance a long-term countdown.</w:t>
       </w:r>
     </w:p>
     <w:p>
@@ -63,7 +63,7 @@
         <w:pStyle w:val="Normal"/>
       </w:pPr>
       <w:r>
-        <w:t xml:space="preserve">Not during immediate danger. Use short rest inside the one-shot; save long rest for between-session recovery or continuation play.</w:t>
+        <w:t xml:space="preserve">Not during immediate danger. Use short rest inside the one-shot; save long rest for continuation play and long-term pressure.</w:t>
       </w:r>
     </w:p>
     <w:p>
@@ -127,6 +127,14 @@
         <w:pStyle w:val="Normal"/>
       </w:pPr>
       <w:r>
+        <w:t xml:space="preserve">countdown</w:t>
+      </w:r>
+    </w:p>
+    <w:p>
+      <w:pPr>
+        <w:pStyle w:val="Normal"/>
+      </w:pPr>
+      <w:r>
         <w:t xml:space="preserve">Source</w:t>
       </w:r>
     </w:p>
@@ -151,7 +159,7 @@
         <w:pStyle w:val="Normal"/>
       </w:pPr>
       <w:r>
-        <w:t xml:space="preserve">Build 2026-06-23T21:40:58 | Content hash e11fd64cf569fbf8 | Source hash dac3370046ed077140fab2d6</w:t>
+        <w:t xml:space="preserve">Build 2026-07-05T12:33:16 | Content hash e15fcb41b55f8a17 | Source hash 6753a06c32e5dca07a19eb73</w:t>
       </w:r>
     </w:p>
     <w:sectPr/>

</xml_diff>